<commit_message>
docs: add core testing guides and refresh email workflow documentation
- add the core features testing guide/checklist and docx generation targets
- update the client review and todo docs for the current stage environment and Inbox/Outbox email flow
- document the latest email intelligence fixes, Google approval submission playbook, and role autonomy findings/remediation plan
</commit_message>
<xml_diff>
--- a/TODO_LIST.docx
+++ b/TODO_LIST.docx
@@ -91,7 +91,7 @@
               <w:rPr>
                 <w:sz w:val="20"/>
               </w:rPr>
-              <w:t>July 28, 2026</w:t>
+              <w:t>July 31, 2026</w:t>
             </w:r>
           </w:p>
         </w:tc>
@@ -148,6 +148,55 @@
       </w:pPr>
       <w:r>
         <w:rPr>
+          <w:b w:val="0"/>
+          <w:sz w:val="20"/>
+        </w:rPr>
+        <w:t xml:space="preserve">Every item below was re-checked against the live source code on </w:t>
+      </w:r>
+      <w:r>
+        <w:rPr>
+          <w:b/>
+          <w:sz w:val="20"/>
+        </w:rPr>
+        <w:t>July 31, 2026</w:t>
+      </w:r>
+      <w:r>
+        <w:rPr>
+          <w:b w:val="0"/>
+          <w:sz w:val="20"/>
+        </w:rPr>
+        <w:t xml:space="preserve">, when </w:t>
+      </w:r>
+      <w:r>
+        <w:rPr>
+          <w:rFonts w:ascii="Consolas" w:hAnsi="Consolas"/>
+          <w:b w:val="0"/>
+          <w:sz w:val="20"/>
+        </w:rPr>
+        <w:t>CORE_FEATURES_TESTING_GUIDE.md</w:t>
+      </w:r>
+      <w:r>
+        <w:rPr>
+          <w:b w:val="0"/>
+          <w:sz w:val="20"/>
+        </w:rPr>
+        <w:t xml:space="preserve"> was written.</w:t>
+      </w:r>
+    </w:p>
+    <w:p>
+      <w:pPr>
+        <w:spacing w:after="40"/>
+        <w:ind w:left="357" w:hanging="255"/>
+      </w:pPr>
+      <w:r>
+        <w:rPr>
+          <w:b w:val="0"/>
+          <w:sz w:val="20"/>
+        </w:rPr>
+        <w:t xml:space="preserve">- </w:t>
+      </w:r>
+      <w:r>
+        <w:rPr>
           <w:b/>
           <w:sz w:val="20"/>
         </w:rPr>
@@ -158,7 +207,20 @@
           <w:b w:val="0"/>
           <w:sz w:val="20"/>
         </w:rPr>
-        <w:t xml:space="preserve"> covers the current round (task lists and email). </w:t>
+        <w:t xml:space="preserve"> — automation and email.</w:t>
+      </w:r>
+    </w:p>
+    <w:p>
+      <w:pPr>
+        <w:spacing w:after="40"/>
+        <w:ind w:left="357" w:hanging="255"/>
+      </w:pPr>
+      <w:r>
+        <w:rPr>
+          <w:b w:val="0"/>
+          <w:sz w:val="20"/>
+        </w:rPr>
+        <w:t xml:space="preserve">- </w:t>
       </w:r>
       <w:r>
         <w:rPr>
@@ -172,7 +234,60 @@
           <w:b w:val="0"/>
           <w:sz w:val="20"/>
         </w:rPr>
-        <w:t xml:space="preserve"> carries over the items from the earlier round, re-checked against the code today.</w:t>
+        <w:t xml:space="preserve"> — everything else, carried forward and re-checked.</w:t>
+      </w:r>
+    </w:p>
+    <w:p>
+      <w:pPr>
+        <w:spacing w:after="40"/>
+        <w:ind w:left="357" w:hanging="255"/>
+      </w:pPr>
+      <w:r>
+        <w:rPr>
+          <w:b w:val="0"/>
+          <w:sz w:val="20"/>
+        </w:rPr>
+        <w:t xml:space="preserve">- </w:t>
+      </w:r>
+      <w:r>
+        <w:rPr>
+          <w:b/>
+          <w:sz w:val="20"/>
+        </w:rPr>
+        <w:t>Section C</w:t>
+      </w:r>
+      <w:r>
+        <w:rPr>
+          <w:b w:val="0"/>
+          <w:sz w:val="20"/>
+        </w:rPr>
+        <w:t xml:space="preserve"> — what has moved </w:t>
+      </w:r>
+      <w:r>
+        <w:rPr>
+          <w:b/>
+          <w:sz w:val="20"/>
+        </w:rPr>
+        <w:t>off</w:t>
+      </w:r>
+      <w:r>
+        <w:rPr>
+          <w:b w:val="0"/>
+          <w:sz w:val="20"/>
+        </w:rPr>
+        <w:t xml:space="preserve"> this list since the last version, so you know</w:t>
+      </w:r>
+    </w:p>
+    <w:p>
+      <w:pPr>
+        <w:spacing w:after="80"/>
+      </w:pPr>
+      <w:r>
+        <w:rPr>
+          <w:b w:val="0"/>
+          <w:sz w:val="20"/>
+        </w:rPr>
+        <w:t>what is now fair game.</w:t>
       </w:r>
     </w:p>
     <w:p>
@@ -198,16 +313,16 @@
         <w:spacing w:after="120" w:before="360"/>
       </w:pPr>
       <w:r>
-        <w:t>Section A — Task lists &amp; email (current round)</w:t>
+        <w:t>Section A — Automation &amp; email</w:t>
       </w:r>
     </w:p>
     <w:p>
       <w:pPr>
-        <w:pStyle w:val="Heading1"/>
-        <w:spacing w:after="120" w:before="360"/>
+        <w:pStyle w:val="Heading2"/>
+        <w:spacing w:after="80" w:before="240"/>
       </w:pPr>
       <w:r>
-        <w:t>A1. Automated emails do not yet fire on a schedule</w:t>
+        <w:t>A1. Automation does not yet run on a timer</w:t>
       </w:r>
     </w:p>
     <w:p>
@@ -245,7 +360,7 @@
           <w:b w:val="0"/>
           <w:sz w:val="20"/>
         </w:rPr>
-        <w:t xml:space="preserve"> The AI sends an Automated task's email when something *triggers* it — creating a deal, or uploading documents to one. Those triggers work today and are covered in the testing guide. What is </w:t>
+        <w:t xml:space="preserve"> the AI acts when something *triggers* it — creating a deal, uploading documents to one, pressing a button. Those triggers work today and are covered in the testing guide. What is </w:t>
       </w:r>
       <w:r>
         <w:rPr>
@@ -259,7 +374,7 @@
           <w:b w:val="0"/>
           <w:sz w:val="20"/>
         </w:rPr>
-        <w:t xml:space="preserve"> switched on yet is the hourly timer that would make the AI act on a deal where nothing has happened recently.</w:t>
+        <w:t xml:space="preserve"> switched on is the hourly timer that would let the AI act on a deal where nothing has happened recently. Settings → AI &amp; Automation says so honestly at the top of the page: *"Automation is not running — the scheduler has never checked in."*</w:t>
       </w:r>
     </w:p>
     <w:p>
@@ -278,7 +393,7 @@
           <w:b w:val="0"/>
           <w:sz w:val="20"/>
         </w:rPr>
-        <w:t xml:space="preserve"> you will see welcome emails send themselves when you upload a deal. You will </w:t>
+        <w:t xml:space="preserve"> you will see welcome emails send themselves when you create a deal. You will </w:t>
       </w:r>
       <w:r>
         <w:rPr>
@@ -292,7 +407,7 @@
           <w:b w:val="0"/>
           <w:sz w:val="20"/>
         </w:rPr>
-        <w:t xml:space="preserve"> see the AI act overnight on an older deal. Please do not report that as a bug yet.</w:t>
+        <w:t xml:space="preserve"> see the AI act overnight on an older deal. Please do not report that as a bug.</w:t>
       </w:r>
     </w:p>
     <w:p>
@@ -311,7 +426,22 @@
           <w:b w:val="0"/>
           <w:sz w:val="20"/>
         </w:rPr>
-        <w:t xml:space="preserve"> Jan to switch on the scheduled run in stage. It is deliberately being done by hand first so we can read exactly what it would send before it sends it.</w:t>
+        <w:t xml:space="preserve"> Jan to switch on the scheduled run in stage. It is deliberately being done by hand first — one manual run, counts read, mailboxes audited — because the job sweeps every workspace and sends real email. The steps are in </w:t>
+      </w:r>
+      <w:r>
+        <w:rPr>
+          <w:rFonts w:ascii="Consolas" w:hAnsi="Consolas"/>
+          <w:b w:val="0"/>
+          <w:sz w:val="20"/>
+        </w:rPr>
+        <w:t>SCHEDULER_AND_STAGE_ENABLEMENT_RUNBOOK.md</w:t>
+      </w:r>
+      <w:r>
+        <w:rPr>
+          <w:b w:val="0"/>
+          <w:sz w:val="20"/>
+        </w:rPr>
+        <w:t>.</w:t>
       </w:r>
     </w:p>
     <w:p>
@@ -321,11 +451,11 @@
     </w:p>
     <w:p>
       <w:pPr>
-        <w:pStyle w:val="Heading1"/>
-        <w:spacing w:after="120" w:before="360"/>
+        <w:pStyle w:val="Heading2"/>
+        <w:spacing w:after="80" w:before="240"/>
       </w:pPr>
       <w:r>
-        <w:t>A2. A stuck AI task has no "Try again" button</w:t>
+        <w:t>A2. A blocked AI task has no "Try again" button</w:t>
       </w:r>
     </w:p>
     <w:p>
@@ -363,7 +493,7 @@
           <w:b w:val="0"/>
           <w:sz w:val="20"/>
         </w:rPr>
-        <w:t xml:space="preserve"> When the AI cannot finish one of its own tasks it tells you why — a missing email address, a missing contract. Once you fix the cause, it picks the task back up on its own the next time that deal is touched. What is missing is a button to say "try it again now".</w:t>
+        <w:t xml:space="preserve"> when the AI cannot finish one of its own tasks it tells you why — a missing email address, a missing contract. Once you fix the cause it picks the task back up on its own the next time that deal is touched. What is missing is a button to say "try it again now".</w:t>
       </w:r>
     </w:p>
     <w:p>
@@ -387,32 +517,13 @@
     </w:p>
     <w:p>
       <w:pPr>
-        <w:spacing w:after="80"/>
-      </w:pPr>
-      <w:r>
-        <w:rPr>
-          <w:b/>
-          <w:sz w:val="20"/>
-        </w:rPr>
-        <w:t>What is still needed:</w:t>
-      </w:r>
-      <w:r>
-        <w:rPr>
-          <w:b w:val="0"/>
-          <w:sz w:val="20"/>
-        </w:rPr>
-        <w:t xml:space="preserve"> a "Try again" action on the task.</w:t>
-      </w:r>
-    </w:p>
-    <w:p>
-      <w:pPr>
         <w:spacing w:after="120"/>
       </w:pPr>
     </w:p>
     <w:p>
       <w:pPr>
-        <w:pStyle w:val="Heading1"/>
-        <w:spacing w:after="120" w:before="360"/>
+        <w:pStyle w:val="Heading2"/>
+        <w:spacing w:after="80" w:before="240"/>
       </w:pPr>
       <w:r>
         <w:t>A3. Emailing a whole group of vendor tasks at once</w:t>
@@ -467,7 +578,7 @@
           <w:b w:val="0"/>
           <w:sz w:val="20"/>
         </w:rPr>
-        <w:t xml:space="preserve"> You can email </w:t>
+        <w:t xml:space="preserve"> you can email </w:t>
       </w:r>
       <w:r>
         <w:rPr>
@@ -505,32 +616,13 @@
     </w:p>
     <w:p>
       <w:pPr>
-        <w:spacing w:after="80"/>
-      </w:pPr>
-      <w:r>
-        <w:rPr>
-          <w:b/>
-          <w:sz w:val="20"/>
-        </w:rPr>
-        <w:t>What is still needed:</w:t>
-      </w:r>
-      <w:r>
-        <w:rPr>
-          <w:b w:val="0"/>
-          <w:sz w:val="20"/>
-        </w:rPr>
-        <w:t xml:space="preserve"> a proper multi-task email that is still sent and logged through Velvet Elves.</w:t>
-      </w:r>
-    </w:p>
-    <w:p>
-      <w:pPr>
         <w:spacing w:after="120"/>
       </w:pPr>
     </w:p>
     <w:p>
       <w:pPr>
-        <w:pStyle w:val="Heading1"/>
-        <w:spacing w:after="120" w:before="360"/>
+        <w:pStyle w:val="Heading2"/>
+        <w:spacing w:after="80" w:before="240"/>
       </w:pPr>
       <w:r>
         <w:t>A4. Two tasks can still share a name</w:t>
@@ -571,7 +663,7 @@
           <w:b w:val="0"/>
           <w:sz w:val="20"/>
         </w:rPr>
-        <w:t xml:space="preserve"> A few tasks in the task database share a name and differ only in who they are addressed to — for example two "Internal Thank You" tasks, one to your own client and one to the co-op agent. They now show a small label saying who each one goes to, so they can be told apart.</w:t>
+        <w:t xml:space="preserve"> a few tasks in the task database share a name and differ only in who they are addressed to — for example two "Internal Thank You" tasks, one to your own client and one to the co-op agent. They show a small label saying who each one goes to, so they can be told apart.</w:t>
       </w:r>
     </w:p>
     <w:p>
@@ -614,11 +706,110 @@
     </w:p>
     <w:p>
       <w:pPr>
-        <w:pStyle w:val="Heading1"/>
-        <w:spacing w:after="120" w:before="360"/>
+        <w:pStyle w:val="Heading2"/>
+        <w:spacing w:after="80" w:before="240"/>
       </w:pPr>
       <w:r>
-        <w:t>A5. iCloud mailboxes cannot be tested for connection health</w:t>
+        <w:t>A5. "Filtered out" is named in the app but does not exist in it</w:t>
+      </w:r>
+    </w:p>
+    <w:p>
+      <w:pPr>
+        <w:spacing w:after="80"/>
+      </w:pPr>
+      <w:r>
+        <w:rPr>
+          <w:b/>
+          <w:sz w:val="20"/>
+        </w:rPr>
+        <w:t>Where:</w:t>
+      </w:r>
+      <w:r>
+        <w:rPr>
+          <w:b w:val="0"/>
+          <w:sz w:val="20"/>
+        </w:rPr>
+        <w:t xml:space="preserve"> Email → Inbox, when you mark a message as not relevant.</w:t>
+      </w:r>
+    </w:p>
+    <w:p>
+      <w:pPr>
+        <w:spacing w:after="80"/>
+      </w:pPr>
+      <w:r>
+        <w:rPr>
+          <w:b/>
+          <w:sz w:val="20"/>
+        </w:rPr>
+        <w:t>Current state:</w:t>
+      </w:r>
+      <w:r>
+        <w:rPr>
+          <w:b w:val="0"/>
+          <w:sz w:val="20"/>
+        </w:rPr>
+        <w:t xml:space="preserve"> the confirmation says the message *"moves to Filtered out"* and that you can *"restore it there any time"*. There is no Filtered out screen. The view existed briefly and was removed on request; the machinery behind it survives, so the message is recoverable </w:t>
+      </w:r>
+      <w:r>
+        <w:rPr>
+          <w:b/>
+          <w:sz w:val="20"/>
+        </w:rPr>
+        <w:t>by us</w:t>
+      </w:r>
+      <w:r>
+        <w:rPr>
+          <w:b w:val="0"/>
+          <w:sz w:val="20"/>
+        </w:rPr>
+        <w:t xml:space="preserve"> but not </w:t>
+      </w:r>
+      <w:r>
+        <w:rPr>
+          <w:b/>
+          <w:sz w:val="20"/>
+        </w:rPr>
+        <w:t>by you</w:t>
+      </w:r>
+      <w:r>
+        <w:rPr>
+          <w:b w:val="0"/>
+          <w:sz w:val="20"/>
+        </w:rPr>
+        <w:t>.</w:t>
+      </w:r>
+    </w:p>
+    <w:p>
+      <w:pPr>
+        <w:spacing w:after="80"/>
+      </w:pPr>
+      <w:r>
+        <w:rPr>
+          <w:b/>
+          <w:sz w:val="20"/>
+        </w:rPr>
+        <w:t>What is still needed:</w:t>
+      </w:r>
+      <w:r>
+        <w:rPr>
+          <w:b w:val="0"/>
+          <w:sz w:val="20"/>
+        </w:rPr>
+        <w:t xml:space="preserve"> either bring the view back, or change the wording so it does not promise a screen that is not there. This is a wording bug we already know about — please do not spend time writing it up.</w:t>
+      </w:r>
+    </w:p>
+    <w:p>
+      <w:pPr>
+        <w:spacing w:after="120"/>
+      </w:pPr>
+    </w:p>
+    <w:p>
+      <w:pPr>
+        <w:pStyle w:val="Heading2"/>
+        <w:spacing w:after="80" w:before="240"/>
+      </w:pPr>
+      <w:r>
+        <w:t>A6. iCloud mailboxes</w:t>
       </w:r>
     </w:p>
     <w:p>
@@ -656,7 +847,35 @@
           <w:b w:val="0"/>
           <w:sz w:val="20"/>
         </w:rPr>
-        <w:t xml:space="preserve"> Gmail and Outlook both have a </w:t>
+        <w:t xml:space="preserve"> only </w:t>
+      </w:r>
+      <w:r>
+        <w:rPr>
+          <w:b/>
+          <w:sz w:val="20"/>
+        </w:rPr>
+        <w:t>Gmail</w:t>
+      </w:r>
+      <w:r>
+        <w:rPr>
+          <w:b w:val="0"/>
+          <w:sz w:val="20"/>
+        </w:rPr>
+        <w:t xml:space="preserve"> and </w:t>
+      </w:r>
+      <w:r>
+        <w:rPr>
+          <w:b/>
+          <w:sz w:val="20"/>
+        </w:rPr>
+        <w:t>Outlook</w:t>
+      </w:r>
+      <w:r>
+        <w:rPr>
+          <w:b w:val="0"/>
+          <w:sz w:val="20"/>
+        </w:rPr>
+        <w:t xml:space="preserve"> are offered. iCloud is intentionally hidden because Apple does not offer a standard one-click sign-in and needs an "app-specific password" flow we still want to review. It also has no equivalent of the </w:t>
       </w:r>
       <w:r>
         <w:rPr>
@@ -670,7 +889,7 @@
           <w:b w:val="0"/>
           <w:sz w:val="20"/>
         </w:rPr>
-        <w:t xml:space="preserve"> button that checks your mailbox without sending anything. iCloud does not — Apple does not offer the same kind of check. iCloud is not shown in the interface at all today (see item B5), so this only matters if we switch it on later.</w:t>
+        <w:t xml:space="preserve"> check the other two have.</w:t>
       </w:r>
     </w:p>
     <w:p>
@@ -684,65 +903,13 @@
         <w:spacing w:after="120" w:before="360"/>
       </w:pPr>
       <w:r>
-        <w:t>A6. Replies coming back in — now confirmed working on stage</w:t>
+        <w:t>Section B — Everything else</w:t>
       </w:r>
     </w:p>
     <w:p>
       <w:pPr>
-        <w:spacing w:after="80"/>
-      </w:pPr>
-      <w:r>
-        <w:rPr>
-          <w:b/>
-          <w:sz w:val="20"/>
-        </w:rPr>
-        <w:t>Where:</w:t>
-      </w:r>
-      <w:r>
-        <w:rPr>
-          <w:b w:val="0"/>
-          <w:sz w:val="20"/>
-        </w:rPr>
-        <w:t xml:space="preserve"> AI Email Review.</w:t>
-      </w:r>
-    </w:p>
-    <w:p>
-      <w:pPr>
-        <w:spacing w:after="80"/>
-      </w:pPr>
-      <w:r>
-        <w:rPr>
-          <w:b/>
-          <w:sz w:val="20"/>
-        </w:rPr>
-        <w:t>Status (July 28, 2026): resolved — this is now testable.</w:t>
-      </w:r>
-      <w:r>
-        <w:rPr>
-          <w:b w:val="0"/>
-          <w:sz w:val="20"/>
-        </w:rPr>
-        <w:t xml:space="preserve"> Jan verified the full round trip on stage: an email sent from a deal was received back, matched to the correct deal, and a suggested reply was prepared. Part 6 of the testing guide no longer needs checking with Jan first.</w:t>
-      </w:r>
-    </w:p>
-    <w:p>
-      <w:pPr>
-        <w:spacing w:after="120"/>
-      </w:pPr>
-    </w:p>
-    <w:p>
-      <w:pPr>
-        <w:pStyle w:val="Heading1"/>
-        <w:spacing w:after="120" w:before="360"/>
-      </w:pPr>
-      <w:r>
-        <w:t>Section B — Earlier round (re-checked July 28, 2026)</w:t>
-      </w:r>
-    </w:p>
-    <w:p>
-      <w:pPr>
-        <w:pStyle w:val="Heading1"/>
-        <w:spacing w:after="120" w:before="360"/>
+        <w:pStyle w:val="Heading2"/>
+        <w:spacing w:after="80" w:before="240"/>
       </w:pPr>
       <w:r>
         <w:t>B1. Sharing page (internal staff) — placeholder</w:t>
@@ -764,7 +931,21 @@
           <w:b w:val="0"/>
           <w:sz w:val="20"/>
         </w:rPr>
-        <w:t xml:space="preserve"> </w:t>
+        <w:t xml:space="preserve"> the </w:t>
+      </w:r>
+      <w:r>
+        <w:rPr>
+          <w:b/>
+          <w:sz w:val="20"/>
+        </w:rPr>
+        <w:t>Sharing</w:t>
+      </w:r>
+      <w:r>
+        <w:rPr>
+          <w:b w:val="0"/>
+          <w:sz w:val="20"/>
+        </w:rPr>
+        <w:t xml:space="preserve"> entry, </w:t>
       </w:r>
       <w:r>
         <w:rPr>
@@ -779,7 +960,7 @@
           <w:b w:val="0"/>
           <w:sz w:val="20"/>
         </w:rPr>
-        <w:t xml:space="preserve"> (the internal "Sharing" surface for Agents / Team Leads / Admins)</w:t>
+        <w:t>.</w:t>
       </w:r>
     </w:p>
     <w:p>
@@ -798,7 +979,7 @@
           <w:b w:val="0"/>
           <w:sz w:val="20"/>
         </w:rPr>
-        <w:t xml:space="preserve"> This page is still a "Coming Soon" placeholder. It does not yet let staff create or manage share links from a dedicated page.</w:t>
+        <w:t xml:space="preserve"> still a "Coming Soon" placeholder. It does not yet let staff create or manage share links from a dedicated page.</w:t>
       </w:r>
     </w:p>
     <w:p>
@@ -817,7 +998,7 @@
           <w:b w:val="0"/>
           <w:sz w:val="20"/>
         </w:rPr>
-        <w:t xml:space="preserve"> Sharing milestone links with sellers already works today </w:t>
+        <w:t xml:space="preserve"> sharing milestone links with sellers already works today </w:t>
       </w:r>
       <w:r>
         <w:rPr>
@@ -831,26 +1012,7 @@
           <w:b w:val="0"/>
           <w:sz w:val="20"/>
         </w:rPr>
-        <w:t xml:space="preserve"> through the "Share milestones" button in their own workspace — that flow is complete and is covered in the testing review. Only the separate internal staff Sharing page is unfinished.</w:t>
-      </w:r>
-    </w:p>
-    <w:p>
-      <w:pPr>
-        <w:spacing w:after="80"/>
-      </w:pPr>
-      <w:r>
-        <w:rPr>
-          <w:b/>
-          <w:sz w:val="20"/>
-        </w:rPr>
-        <w:t>What is still needed:</w:t>
-      </w:r>
-      <w:r>
-        <w:rPr>
-          <w:b w:val="0"/>
-          <w:sz w:val="20"/>
-        </w:rPr>
-        <w:t xml:space="preserve"> A real share-link manager (create a link, see live links, revoke a link) for internal staff.</w:t>
+        <w:t xml:space="preserve"> through the "Share milestones" button in their own workspace. Only the separate internal staff Sharing page is unfinished.</w:t>
       </w:r>
     </w:p>
     <w:p>
@@ -860,8 +1022,8 @@
     </w:p>
     <w:p>
       <w:pPr>
-        <w:pStyle w:val="Heading1"/>
-        <w:spacing w:after="120" w:before="360"/>
+        <w:pStyle w:val="Heading2"/>
+        <w:spacing w:after="80" w:before="240"/>
       </w:pPr>
       <w:r>
         <w:t>B2. In-app password change — not built yet</w:t>
@@ -902,7 +1064,7 @@
           <w:b w:val="0"/>
           <w:sz w:val="20"/>
         </w:rPr>
-        <w:t xml:space="preserve"> You can now edit your name, photo, phone, bio, email signature, and even your sign-in </w:t>
+        <w:t xml:space="preserve"> you can edit your photo, name, phone, bio, email signature, and your sign-in </w:t>
       </w:r>
       <w:r>
         <w:rPr>
@@ -916,7 +1078,7 @@
           <w:b w:val="0"/>
           <w:sz w:val="20"/>
         </w:rPr>
-        <w:t xml:space="preserve"> from Settings → Profile (this is complete and covered in the review, feature 28.1). The one piece still missing is changing your </w:t>
+        <w:t xml:space="preserve">. The one piece still missing is changing your </w:t>
       </w:r>
       <w:r>
         <w:rPr>
@@ -930,7 +1092,7 @@
           <w:b w:val="0"/>
           <w:sz w:val="20"/>
         </w:rPr>
-        <w:t xml:space="preserve"> from inside the app — there is no password field on the Profile page yet.</w:t>
+        <w:t xml:space="preserve"> from inside the app.</w:t>
       </w:r>
     </w:p>
     <w:p>
@@ -942,26 +1104,14 @@
           <w:b/>
           <w:sz w:val="20"/>
         </w:rPr>
-        <w:t>What is still needed:</w:t>
+        <w:t>For now:</w:t>
       </w:r>
       <w:r>
         <w:rPr>
           <w:b w:val="0"/>
           <w:sz w:val="20"/>
         </w:rPr>
-        <w:t xml:space="preserve"> An account-security control to change your password while signed in. For now, use the "Forgot password?" link on the sign-in page to reset it.</w:t>
-      </w:r>
-    </w:p>
-    <w:p>
-      <w:pPr>
-        <w:spacing w:after="80"/>
-      </w:pPr>
-      <w:r>
-        <w:rPr>
-          <w:b w:val="0"/>
-          <w:sz w:val="20"/>
-        </w:rPr>
-        <w:t>&gt; This replaces the earlier "change email / change password" item — changing your email &gt; address inside the app is now done.</w:t>
+        <w:t xml:space="preserve"> use the "Forgot password?" link on the sign-in page.</w:t>
       </w:r>
     </w:p>
     <w:p>
@@ -971,11 +1121,11 @@
     </w:p>
     <w:p>
       <w:pPr>
-        <w:pStyle w:val="Heading1"/>
-        <w:spacing w:after="120" w:before="360"/>
+        <w:pStyle w:val="Heading2"/>
+        <w:spacing w:after="80" w:before="240"/>
       </w:pPr>
       <w:r>
-        <w:t>B3. Credit wallet &amp; billing — switched off for now</w:t>
+        <w:t>B3. AI Coach — intentionally switched off</w:t>
       </w:r>
     </w:p>
     <w:p>
@@ -994,49 +1144,21 @@
           <w:b w:val="0"/>
           <w:sz w:val="20"/>
         </w:rPr>
-        <w:t xml:space="preserve"> Settings → </w:t>
+        <w:t xml:space="preserve"> the "Add the AI Real Estate Coach" block on the solo-agent dashboard, and the locked </w:t>
       </w:r>
       <w:r>
         <w:rPr>
           <w:b/>
           <w:sz w:val="20"/>
         </w:rPr>
-        <w:t>Billing &amp; Credits</w:t>
+        <w:t>AI Coach</w:t>
       </w:r>
       <w:r>
         <w:rPr>
           <w:b w:val="0"/>
           <w:sz w:val="20"/>
         </w:rPr>
-        <w:t xml:space="preserve"> (workspace Admins / owners) and the Settings hub's </w:t>
-      </w:r>
-      <w:r>
-        <w:rPr>
-          <w:b/>
-          <w:sz w:val="20"/>
-        </w:rPr>
-        <w:t>Platform</w:t>
-      </w:r>
-      <w:r>
-        <w:rPr>
-          <w:b w:val="0"/>
-          <w:sz w:val="20"/>
-        </w:rPr>
-        <w:t xml:space="preserve"> group → </w:t>
-      </w:r>
-      <w:r>
-        <w:rPr>
-          <w:b/>
-          <w:sz w:val="20"/>
-        </w:rPr>
-        <w:t>Platform Billing</w:t>
-      </w:r>
-      <w:r>
-        <w:rPr>
-          <w:b w:val="0"/>
-          <w:sz w:val="20"/>
-        </w:rPr>
-        <w:t xml:space="preserve"> (internal Velvet Elves staff).</w:t>
+        <w:t xml:space="preserve"> entry Team Leaders see in the sidebar.</w:t>
       </w:r>
     </w:p>
     <w:p>
@@ -1055,54 +1177,35 @@
           <w:b w:val="0"/>
           <w:sz w:val="20"/>
         </w:rPr>
-        <w:t xml:space="preserve"> The credit-wallet billing system — buying credits, per-transaction pricing, the Stripe checkout flow, credit history, and the platform-side credit-pack pricing and billing-health screens — is built but </w:t>
+        <w:t xml:space="preserve"> deliberately off. AI Coach is planned as a future paid add-on, so it is not part of this release. The promotional block is visible but its </w:t>
       </w:r>
       <w:r>
         <w:rPr>
           <w:b/>
           <w:sz w:val="20"/>
         </w:rPr>
-        <w:t>switched off behind a feature flag</w:t>
+        <w:t>Add AI Coach</w:t>
       </w:r>
       <w:r>
         <w:rPr>
           <w:b w:val="0"/>
           <w:sz w:val="20"/>
         </w:rPr>
-        <w:t xml:space="preserve"> while pricing is being finalised. With the flag off, the </w:t>
+        <w:t xml:space="preserve"> and </w:t>
       </w:r>
       <w:r>
         <w:rPr>
           <w:b/>
           <w:sz w:val="20"/>
         </w:rPr>
-        <w:t>Billing &amp; Credits</w:t>
+        <w:t>See how it works</w:t>
       </w:r>
       <w:r>
         <w:rPr>
           <w:b w:val="0"/>
           <w:sz w:val="20"/>
         </w:rPr>
-        <w:t xml:space="preserve"> card does not appear in the Settings hub and creating a transaction is free.</w:t>
-      </w:r>
-    </w:p>
-    <w:p>
-      <w:pPr>
-        <w:spacing w:after="80"/>
-      </w:pPr>
-      <w:r>
-        <w:rPr>
-          <w:b/>
-          <w:sz w:val="20"/>
-        </w:rPr>
-        <w:t>What is still needed:</w:t>
-      </w:r>
-      <w:r>
-        <w:rPr>
-          <w:b w:val="0"/>
-          <w:sz w:val="20"/>
-        </w:rPr>
-        <w:t xml:space="preserve"> Final pricing sign-off, then switch the flag on. Until then we are not asking for feedback on the billing screens.</w:t>
+        <w:t xml:space="preserve"> buttons do nothing.</w:t>
       </w:r>
     </w:p>
     <w:p>
@@ -1112,11 +1215,11 @@
     </w:p>
     <w:p>
       <w:pPr>
-        <w:pStyle w:val="Heading1"/>
-        <w:spacing w:after="120" w:before="360"/>
+        <w:pStyle w:val="Heading2"/>
+        <w:spacing w:after="80" w:before="240"/>
       </w:pPr>
       <w:r>
-        <w:t>B4. AI Coach / "AI Coach Pro" advanced analytics — intentionally switched off</w:t>
+        <w:t>B4. AI deal workspace — a few extras still on the way</w:t>
       </w:r>
     </w:p>
     <w:p>
@@ -1135,7 +1238,7 @@
           <w:b w:val="0"/>
           <w:sz w:val="20"/>
         </w:rPr>
-        <w:t xml:space="preserve"> The sidebar "AI Coach" entry (Team dashboards) and the "AI Coach Pro — Advanced Analytics" block on the Analytics page.</w:t>
+        <w:t xml:space="preserve"> the deal workspace that opens when you click a single transaction.</w:t>
       </w:r>
     </w:p>
     <w:p>
@@ -1154,234 +1257,21 @@
           <w:b w:val="0"/>
           <w:sz w:val="20"/>
         </w:rPr>
-        <w:t xml:space="preserve"> These coaching surfaces are deliberately turned </w:t>
+        <w:t xml:space="preserve"> the workspace itself is </w:t>
       </w:r>
       <w:r>
         <w:rPr>
           <w:b/>
           <w:sz w:val="20"/>
         </w:rPr>
-        <w:t>off</w:t>
+        <w:t>complete and in this round's testing guide</w:t>
       </w:r>
       <w:r>
         <w:rPr>
           <w:b w:val="0"/>
           <w:sz w:val="20"/>
         </w:rPr>
-        <w:t xml:space="preserve"> for now. AI Coach is planned as a future paid add-on, so it is not part of this release and not ready for feedback.</w:t>
-      </w:r>
-    </w:p>
-    <w:p>
-      <w:pPr>
-        <w:spacing w:after="80"/>
-      </w:pPr>
-      <w:r>
-        <w:rPr>
-          <w:b/>
-          <w:sz w:val="20"/>
-        </w:rPr>
-        <w:t>What is still needed:</w:t>
-      </w:r>
-      <w:r>
-        <w:rPr>
-          <w:b w:val="0"/>
-          <w:sz w:val="20"/>
-        </w:rPr>
-        <w:t xml:space="preserve"> Build and enable the AI Coach experience when that add-on is in scope.</w:t>
-      </w:r>
-    </w:p>
-    <w:p>
-      <w:pPr>
-        <w:spacing w:after="120"/>
-      </w:pPr>
-    </w:p>
-    <w:p>
-      <w:pPr>
-        <w:pStyle w:val="Heading1"/>
-        <w:spacing w:after="120" w:before="360"/>
-      </w:pPr>
-      <w:r>
-        <w:t>B5. iCloud email integration — hidden for now</w:t>
-      </w:r>
-    </w:p>
-    <w:p>
-      <w:pPr>
-        <w:spacing w:after="80"/>
-      </w:pPr>
-      <w:r>
-        <w:rPr>
-          <w:b/>
-          <w:sz w:val="20"/>
-        </w:rPr>
-        <w:t>Where:</w:t>
-      </w:r>
-      <w:r>
-        <w:rPr>
-          <w:b w:val="0"/>
-          <w:sz w:val="20"/>
-        </w:rPr>
-        <w:t xml:space="preserve"> Settings → Email &amp; E-signature.</w:t>
-      </w:r>
-    </w:p>
-    <w:p>
-      <w:pPr>
-        <w:spacing w:after="80"/>
-      </w:pPr>
-      <w:r>
-        <w:rPr>
-          <w:b/>
-          <w:sz w:val="20"/>
-        </w:rPr>
-        <w:t>Current state:</w:t>
-      </w:r>
-      <w:r>
-        <w:rPr>
-          <w:b w:val="0"/>
-          <w:sz w:val="20"/>
-        </w:rPr>
-        <w:t xml:space="preserve"> Only </w:t>
-      </w:r>
-      <w:r>
-        <w:rPr>
-          <w:b/>
-          <w:sz w:val="20"/>
-        </w:rPr>
-        <w:t>Gmail</w:t>
-      </w:r>
-      <w:r>
-        <w:rPr>
-          <w:b w:val="0"/>
-          <w:sz w:val="20"/>
-        </w:rPr>
-        <w:t xml:space="preserve"> and </w:t>
-      </w:r>
-      <w:r>
-        <w:rPr>
-          <w:b/>
-          <w:sz w:val="20"/>
-        </w:rPr>
-        <w:t>Outlook</w:t>
-      </w:r>
-      <w:r>
-        <w:rPr>
-          <w:b w:val="0"/>
-          <w:sz w:val="20"/>
-        </w:rPr>
-        <w:t xml:space="preserve"> are offered today (both complete and in the review). iCloud is intentionally hidden because Apple does not offer a standard one-click sign-in and needs an "app-specific password" flow we still want to review.</w:t>
-      </w:r>
-    </w:p>
-    <w:p>
-      <w:pPr>
-        <w:spacing w:after="80"/>
-      </w:pPr>
-      <w:r>
-        <w:rPr>
-          <w:b/>
-          <w:sz w:val="20"/>
-        </w:rPr>
-        <w:t>What is still needed:</w:t>
-      </w:r>
-      <w:r>
-        <w:rPr>
-          <w:b w:val="0"/>
-          <w:sz w:val="20"/>
-        </w:rPr>
-        <w:t xml:space="preserve"> Finish and re-enable the iCloud (Apple Mail) connection flow.</w:t>
-      </w:r>
-    </w:p>
-    <w:p>
-      <w:pPr>
-        <w:spacing w:after="120"/>
-      </w:pPr>
-    </w:p>
-    <w:p>
-      <w:pPr>
-        <w:pStyle w:val="Heading1"/>
-        <w:spacing w:after="120" w:before="360"/>
-      </w:pPr>
-      <w:r>
-        <w:t>B6. AI deal workspace — parts still on the way</w:t>
-      </w:r>
-    </w:p>
-    <w:p>
-      <w:pPr>
-        <w:spacing w:after="80"/>
-      </w:pPr>
-      <w:r>
-        <w:rPr>
-          <w:b/>
-          <w:sz w:val="20"/>
-        </w:rPr>
-        <w:t>Where:</w:t>
-      </w:r>
-      <w:r>
-        <w:rPr>
-          <w:b w:val="0"/>
-          <w:sz w:val="20"/>
-        </w:rPr>
-        <w:t xml:space="preserve"> The AI deal workspace that opens when you click a single transaction (</w:t>
-      </w:r>
-      <w:r>
-        <w:rPr>
-          <w:rFonts w:ascii="Consolas" w:hAnsi="Consolas"/>
-          <w:b w:val="0"/>
-          <w:sz w:val="20"/>
-        </w:rPr>
-        <w:t>/transactions/&lt;deal&gt;</w:t>
-      </w:r>
-      <w:r>
-        <w:rPr>
-          <w:b w:val="0"/>
-          <w:sz w:val="20"/>
-        </w:rPr>
-        <w:t>).</w:t>
-      </w:r>
-    </w:p>
-    <w:p>
-      <w:pPr>
-        <w:spacing w:after="80"/>
-      </w:pPr>
-      <w:r>
-        <w:rPr>
-          <w:b/>
-          <w:sz w:val="20"/>
-        </w:rPr>
-        <w:t>Current state:</w:t>
-      </w:r>
-      <w:r>
-        <w:rPr>
-          <w:b w:val="0"/>
-          <w:sz w:val="20"/>
-        </w:rPr>
-        <w:t xml:space="preserve"> The deal workspace is </w:t>
-      </w:r>
-      <w:r>
-        <w:rPr>
-          <w:b/>
-          <w:sz w:val="20"/>
-        </w:rPr>
-        <w:t>complete and in the testing review</w:t>
-      </w:r>
-      <w:r>
-        <w:rPr>
-          <w:b w:val="0"/>
-          <w:sz w:val="20"/>
-        </w:rPr>
-        <w:t xml:space="preserve"> (items 17.1–17.8): the AI assistant, the suggestions and one-click fixes, the safe date moves, document analysis on upload, the deal tabs, and the Email tab are all ready for your feedback. A few </w:t>
-      </w:r>
-      <w:r>
-        <w:rPr>
-          <w:b/>
-          <w:sz w:val="20"/>
-        </w:rPr>
-        <w:t>extras around it are still being built</w:t>
-      </w:r>
-      <w:r>
-        <w:rPr>
-          <w:b w:val="0"/>
-          <w:sz w:val="20"/>
-        </w:rPr>
-        <w:t>, so we are not asking for feedback on these specific pieces yet:</w:t>
+        <w:t xml:space="preserve"> — the AI assistant, its proposals and approvals, the safe date moves, document analysis on upload, and all seven tabs (Timeline, Compliance, Documents, Tasks, People, Activity, Email). A few extras around it are still being built:</w:t>
       </w:r>
     </w:p>
     <w:p>
@@ -1408,7 +1298,7 @@
           <w:b w:val="0"/>
           <w:sz w:val="20"/>
         </w:rPr>
-        <w:t xml:space="preserve"> A microphone button is shown in the assistant's message box but is switched off</w:t>
+        <w:t xml:space="preserve"> A microphone button is shown in the assistant's message box but is</w:t>
       </w:r>
     </w:p>
     <w:p>
@@ -1420,7 +1310,7 @@
           <w:b w:val="0"/>
           <w:sz w:val="20"/>
         </w:rPr>
-        <w:t>for now ("coming soon"). Typing works fully today.</w:t>
+        <w:t>switched off ("coming soon"). Typing works fully today.</w:t>
       </w:r>
     </w:p>
     <w:p>
@@ -1447,7 +1337,7 @@
           <w:b w:val="0"/>
           <w:sz w:val="20"/>
         </w:rPr>
-        <w:t xml:space="preserve"> Today the assistant points you to the Documents tab to open a file;</w:t>
+        <w:t xml:space="preserve"> The assistant points you to the Documents tab to open a</w:t>
       </w:r>
     </w:p>
     <w:p>
@@ -1459,7 +1349,7 @@
           <w:b w:val="0"/>
           <w:sz w:val="20"/>
         </w:rPr>
-        <w:t>opening the document inside the assistant window itself is still being built.</w:t>
+        <w:t>file; opening it inside the assistant window is still being built.</w:t>
       </w:r>
     </w:p>
     <w:p>
@@ -1479,14 +1369,14 @@
           <w:b/>
           <w:sz w:val="20"/>
         </w:rPr>
-        <w:t>Re-filing an email to the right deal.</w:t>
+        <w:t>Re-filing an email onto the right deal.</w:t>
       </w:r>
       <w:r>
         <w:rPr>
           <w:b w:val="0"/>
           <w:sz w:val="20"/>
         </w:rPr>
-        <w:t xml:space="preserve"> The Email tab's Outbox and Inbox are complete; the tool to</w:t>
+        <w:t xml:space="preserve"> The Email tab's Outbox and Inbox are</w:t>
       </w:r>
     </w:p>
     <w:p>
@@ -1498,46 +1388,7 @@
           <w:b w:val="0"/>
           <w:sz w:val="20"/>
         </w:rPr>
-        <w:t>move an email that landed on the wrong deal is not built yet.</w:t>
-      </w:r>
-    </w:p>
-    <w:p>
-      <w:pPr>
-        <w:spacing w:after="40"/>
-        <w:ind w:left="357" w:hanging="255"/>
-      </w:pPr>
-      <w:r>
-        <w:rPr>
-          <w:b w:val="0"/>
-          <w:sz w:val="20"/>
-        </w:rPr>
-        <w:t xml:space="preserve">- </w:t>
-      </w:r>
-      <w:r>
-        <w:rPr>
-          <w:b/>
-          <w:sz w:val="20"/>
-        </w:rPr>
-        <w:t>A full activity feed of the assistant's actions.</w:t>
-      </w:r>
-      <w:r>
-        <w:rPr>
-          <w:b w:val="0"/>
-          <w:sz w:val="20"/>
-        </w:rPr>
-        <w:t xml:space="preserve"> The Activity tab already shows date changes,</w:t>
-      </w:r>
-    </w:p>
-    <w:p>
-      <w:pPr>
-        <w:spacing w:after="80"/>
-      </w:pPr>
-      <w:r>
-        <w:rPr>
-          <w:b w:val="0"/>
-          <w:sz w:val="20"/>
-        </w:rPr>
-        <w:t>status updates, and checklist edits. A complete, single feed of every AI action is still being expanded — for now, each applied action points you to the tab where you can see its result.</w:t>
+        <w:t>complete, and the machinery to move a misfiled email exists — but there is no button for it yet.</w:t>
       </w:r>
     </w:p>
     <w:p>
@@ -1564,7 +1415,7 @@
           <w:b w:val="0"/>
           <w:sz w:val="20"/>
         </w:rPr>
-        <w:t xml:space="preserve"> These are planned for a later</w:t>
+        <w:t xml:space="preserve"> Planned for a</w:t>
       </w:r>
     </w:p>
     <w:p>
@@ -1576,7 +1427,87 @@
           <w:b w:val="0"/>
           <w:sz w:val="20"/>
         </w:rPr>
-        <w:t>stage. Today every AI action requires your explicit approval, one at a time, which is by design.</w:t>
+        <w:t>later stage. Today every AI action requires your explicit approval, one at a time, which is by design.</w:t>
+      </w:r>
+    </w:p>
+    <w:p>
+      <w:pPr>
+        <w:spacing w:after="120"/>
+      </w:pPr>
+    </w:p>
+    <w:p>
+      <w:pPr>
+        <w:pStyle w:val="Heading2"/>
+        <w:spacing w:after="80" w:before="240"/>
+      </w:pPr>
+      <w:r>
+        <w:t>B5. New Transaction wizard — address type-ahead is switched off</w:t>
+      </w:r>
+    </w:p>
+    <w:p>
+      <w:pPr>
+        <w:spacing w:after="80"/>
+      </w:pPr>
+      <w:r>
+        <w:rPr>
+          <w:b/>
+          <w:sz w:val="20"/>
+        </w:rPr>
+        <w:t>Where:</w:t>
+      </w:r>
+      <w:r>
+        <w:rPr>
+          <w:b w:val="0"/>
+          <w:sz w:val="20"/>
+        </w:rPr>
+        <w:t xml:space="preserve"> New Transaction wizard, the Street Address field.</w:t>
+      </w:r>
+    </w:p>
+    <w:p>
+      <w:pPr>
+        <w:spacing w:after="80"/>
+      </w:pPr>
+      <w:r>
+        <w:rPr>
+          <w:b/>
+          <w:sz w:val="20"/>
+        </w:rPr>
+        <w:t>Current state:</w:t>
+      </w:r>
+      <w:r>
+        <w:rPr>
+          <w:b w:val="0"/>
+          <w:sz w:val="20"/>
+        </w:rPr>
+        <w:t xml:space="preserve"> the field still suggests addresses you have used before, and AI parsing fills the address from an uploaded contract. The </w:t>
+      </w:r>
+      <w:r>
+        <w:rPr>
+          <w:b/>
+          <w:sz w:val="20"/>
+        </w:rPr>
+        <w:t>live address type-ahead</w:t>
+      </w:r>
+      <w:r>
+        <w:rPr>
+          <w:b w:val="0"/>
+          <w:sz w:val="20"/>
+        </w:rPr>
+        <w:t xml:space="preserve"> (Google-powered "start typing and pick a real address") is </w:t>
+      </w:r>
+      <w:r>
+        <w:rPr>
+          <w:b/>
+          <w:sz w:val="20"/>
+        </w:rPr>
+        <w:t>switched off</w:t>
+      </w:r>
+      <w:r>
+        <w:rPr>
+          <w:b w:val="0"/>
+          <w:sz w:val="20"/>
+        </w:rPr>
+        <w:t xml:space="preserve"> in every environment because the map-service key is not configured.</w:t>
       </w:r>
     </w:p>
     <w:p>
@@ -1595,7 +1526,19 @@
           <w:b w:val="0"/>
           <w:sz w:val="20"/>
         </w:rPr>
-        <w:t xml:space="preserve"> Finish and switch on the items above as their later phases are completed.</w:t>
+        <w:t xml:space="preserve"> add the address-service key and switch it back on.</w:t>
+      </w:r>
+    </w:p>
+    <w:p>
+      <w:pPr>
+        <w:spacing w:after="80"/>
+      </w:pPr>
+      <w:r>
+        <w:rPr>
+          <w:b w:val="0"/>
+          <w:sz w:val="20"/>
+        </w:rPr>
+        <w:t>&gt; The wizard as a whole is not part of the current testing round — it has its own guide.</w:t>
       </w:r>
     </w:p>
     <w:p>
@@ -1605,11 +1548,11 @@
     </w:p>
     <w:p>
       <w:pPr>
-        <w:pStyle w:val="Heading1"/>
-        <w:spacing w:after="120" w:before="360"/>
+        <w:pStyle w:val="Heading2"/>
+        <w:spacing w:after="80" w:before="240"/>
       </w:pPr>
       <w:r>
-        <w:t>B7. New Transaction wizard — address type-ahead is switched off for now</w:t>
+        <w:t>B6. Belonging to more than one workspace — waiting on a billing decision</w:t>
       </w:r>
     </w:p>
     <w:p>
@@ -1628,7 +1571,7 @@
           <w:b w:val="0"/>
           <w:sz w:val="20"/>
         </w:rPr>
-        <w:t xml:space="preserve"> New Transaction wizard → Step 3 (Address &amp; Contacts), the Street Address field.</w:t>
+        <w:t xml:space="preserve"> the workspace switcher near the top of the sidebar, and the "guest" invite flow (being invited into another brokerage with an email you already use).</w:t>
       </w:r>
     </w:p>
     <w:p>
@@ -1647,120 +1590,21 @@
           <w:b w:val="0"/>
           <w:sz w:val="20"/>
         </w:rPr>
-        <w:t xml:space="preserve"> The Street Address field still suggests addresses you have used before, and AI parsing fills the address from an uploaded contract. The </w:t>
+        <w:t xml:space="preserve"> this is now </w:t>
       </w:r>
       <w:r>
         <w:rPr>
           <w:b/>
           <w:sz w:val="20"/>
         </w:rPr>
-        <w:t>live address type-ahead</w:t>
+        <w:t>on by default</w:t>
       </w:r>
       <w:r>
         <w:rPr>
           <w:b w:val="0"/>
           <w:sz w:val="20"/>
         </w:rPr>
-        <w:t xml:space="preserve"> (Google-powered "start typing and pick a real address" suggestions) is </w:t>
-      </w:r>
-      <w:r>
-        <w:rPr>
-          <w:b/>
-          <w:sz w:val="20"/>
-        </w:rPr>
-        <w:t>temporarily switched off</w:t>
-      </w:r>
-      <w:r>
-        <w:rPr>
-          <w:b w:val="0"/>
-          <w:sz w:val="20"/>
-        </w:rPr>
-        <w:t xml:space="preserve"> because the map service key is not configured in this environment — so we are not asking for feedback on it yet. Every other part of Step 3 is complete and is in the testing review.</w:t>
-      </w:r>
-    </w:p>
-    <w:p>
-      <w:pPr>
-        <w:spacing w:after="80"/>
-      </w:pPr>
-      <w:r>
-        <w:rPr>
-          <w:b/>
-          <w:sz w:val="20"/>
-        </w:rPr>
-        <w:t>What is still needed:</w:t>
-      </w:r>
-      <w:r>
-        <w:rPr>
-          <w:b w:val="0"/>
-          <w:sz w:val="20"/>
-        </w:rPr>
-        <w:t xml:space="preserve"> Add the address-service key and switch the live type-ahead back on.</w:t>
-      </w:r>
-    </w:p>
-    <w:p>
-      <w:pPr>
-        <w:spacing w:after="120"/>
-      </w:pPr>
-    </w:p>
-    <w:p>
-      <w:pPr>
-        <w:pStyle w:val="Heading1"/>
-        <w:spacing w:after="120" w:before="360"/>
-      </w:pPr>
-      <w:r>
-        <w:t>B8. Belonging to more than one workspace — waiting on a billing decision</w:t>
-      </w:r>
-    </w:p>
-    <w:p>
-      <w:pPr>
-        <w:spacing w:after="80"/>
-      </w:pPr>
-      <w:r>
-        <w:rPr>
-          <w:b/>
-          <w:sz w:val="20"/>
-        </w:rPr>
-        <w:t>Where:</w:t>
-      </w:r>
-      <w:r>
-        <w:rPr>
-          <w:b w:val="0"/>
-          <w:sz w:val="20"/>
-        </w:rPr>
-        <w:t xml:space="preserve"> A workspace switcher near the top of the sidebar, and the "guest" invite flow (being invited into another brokerage with an email you already use).</w:t>
-      </w:r>
-    </w:p>
-    <w:p>
-      <w:pPr>
-        <w:spacing w:after="80"/>
-      </w:pPr>
-      <w:r>
-        <w:rPr>
-          <w:b/>
-          <w:sz w:val="20"/>
-        </w:rPr>
-        <w:t>Current state (updated July 28, 2026):</w:t>
-      </w:r>
-      <w:r>
-        <w:rPr>
-          <w:b w:val="0"/>
-          <w:sz w:val="20"/>
-        </w:rPr>
-        <w:t xml:space="preserve"> The feature flag is now </w:t>
-      </w:r>
-      <w:r>
-        <w:rPr>
-          <w:b/>
-          <w:sz w:val="20"/>
-        </w:rPr>
-        <w:t>on</w:t>
-      </w:r>
-      <w:r>
-        <w:rPr>
-          <w:b w:val="0"/>
-          <w:sz w:val="20"/>
-        </w:rPr>
-        <w:t xml:space="preserve"> in the local and stage environments, so the workspace switcher appears and guest invitations work. What is still outstanding is the </w:t>
+        <w:t xml:space="preserve"> in every environment, so the switcher appears and guest invitations work. What is still outstanding is the </w:t>
       </w:r>
       <w:r>
         <w:rPr>
@@ -1774,7 +1618,7 @@
           <w:b w:val="0"/>
           <w:sz w:val="20"/>
         </w:rPr>
-        <w:t xml:space="preserve"> — who pays when someone from another brokerage is working in your workspace. That is a pricing decision, not code.</w:t>
+        <w:t xml:space="preserve"> — who pays when someone from another brokerage is working in your workspace. That is a pricing decision, not code. Until it is settled, a guest occupies no seat in the host workspace.</w:t>
       </w:r>
     </w:p>
     <w:p>
@@ -1803,6 +1647,372 @@
     </w:p>
     <w:p>
       <w:pPr>
+        <w:pStyle w:val="Heading2"/>
+        <w:spacing w:after="80" w:before="240"/>
+      </w:pPr>
+      <w:r>
+        <w:t>B7. Help Center content</w:t>
+      </w:r>
+    </w:p>
+    <w:p>
+      <w:pPr>
+        <w:spacing w:after="80"/>
+      </w:pPr>
+      <w:r>
+        <w:rPr>
+          <w:b/>
+          <w:sz w:val="20"/>
+        </w:rPr>
+        <w:t>Where:</w:t>
+      </w:r>
+      <w:r>
+        <w:rPr>
+          <w:b w:val="0"/>
+          <w:sz w:val="20"/>
+        </w:rPr>
+        <w:t xml:space="preserve"> the Help Center link in the avatar menu and Settings → Help &amp; Tour.</w:t>
+      </w:r>
+    </w:p>
+    <w:p>
+      <w:pPr>
+        <w:spacing w:after="80"/>
+      </w:pPr>
+      <w:r>
+        <w:rPr>
+          <w:b/>
+          <w:sz w:val="20"/>
+        </w:rPr>
+        <w:t>Current state:</w:t>
+      </w:r>
+      <w:r>
+        <w:rPr>
+          <w:b w:val="0"/>
+          <w:sz w:val="20"/>
+        </w:rPr>
+        <w:t xml:space="preserve"> the Help Center is a separate website with its own authoring tools behind the platform screens. The rewritten article set exists but has not been loaded into the live database, so what you see may be thin or out of date.</w:t>
+      </w:r>
+    </w:p>
+    <w:p>
+      <w:pPr>
+        <w:spacing w:after="80"/>
+      </w:pPr>
+      <w:r>
+        <w:rPr>
+          <w:b/>
+          <w:sz w:val="20"/>
+        </w:rPr>
+        <w:t>What is still needed:</w:t>
+      </w:r>
+      <w:r>
+        <w:rPr>
+          <w:b w:val="0"/>
+          <w:sz w:val="20"/>
+        </w:rPr>
+        <w:t xml:space="preserve"> load the article set, then re-check the links from inside the app.</w:t>
+      </w:r>
+    </w:p>
+    <w:p>
+      <w:pPr>
+        <w:spacing w:after="120"/>
+      </w:pPr>
+    </w:p>
+    <w:p>
+      <w:pPr>
+        <w:pStyle w:val="Heading1"/>
+        <w:spacing w:after="120" w:before="360"/>
+      </w:pPr>
+      <w:r>
+        <w:t>Section C — What has moved off this list</w:t>
+      </w:r>
+    </w:p>
+    <w:p>
+      <w:pPr>
+        <w:spacing w:after="80"/>
+      </w:pPr>
+      <w:r>
+        <w:rPr>
+          <w:b w:val="0"/>
+          <w:sz w:val="20"/>
+        </w:rPr>
+        <w:t xml:space="preserve">These were on the previous version of this list and are now </w:t>
+      </w:r>
+      <w:r>
+        <w:rPr>
+          <w:b/>
+          <w:sz w:val="20"/>
+        </w:rPr>
+        <w:t>ready for your feedback</w:t>
+      </w:r>
+      <w:r>
+        <w:rPr>
+          <w:b w:val="0"/>
+          <w:sz w:val="20"/>
+        </w:rPr>
+        <w:t xml:space="preserve">. They are covered in </w:t>
+      </w:r>
+      <w:r>
+        <w:rPr>
+          <w:rFonts w:ascii="Consolas" w:hAnsi="Consolas"/>
+          <w:b w:val="0"/>
+          <w:sz w:val="20"/>
+        </w:rPr>
+        <w:t>CORE_FEATURES_TESTING_GUIDE.md</w:t>
+      </w:r>
+      <w:r>
+        <w:rPr>
+          <w:b w:val="0"/>
+          <w:sz w:val="20"/>
+        </w:rPr>
+        <w:t>.</w:t>
+      </w:r>
+    </w:p>
+    <w:tbl>
+      <w:tblPr>
+        <w:tblStyle w:val="LightGrid-Accent1"/>
+        <w:tblW w:type="auto" w:w="0"/>
+        <w:jc w:val="center"/>
+        <w:tblLook w:firstColumn="1" w:firstRow="1" w:lastColumn="0" w:lastRow="0" w:noHBand="0" w:noVBand="1" w:val="04A0"/>
+      </w:tblPr>
+      <w:tblGrid>
+        <w:gridCol w:w="4680"/>
+        <w:gridCol w:w="4680"/>
+      </w:tblGrid>
+      <w:tr>
+        <w:tc>
+          <w:tcPr>
+            <w:tcW w:type="dxa" w:w="4680"/>
+            <w:shd w:val="clear" w:color="auto" w:fill="D9E2F3"/>
+          </w:tcPr>
+          <w:p>
+            <w:pPr>
+              <w:spacing w:after="0"/>
+            </w:pPr>
+            <w:r/>
+            <w:r>
+              <w:rPr>
+                <w:b/>
+                <w:sz w:val="20"/>
+              </w:rPr>
+              <w:t>Was</w:t>
+            </w:r>
+          </w:p>
+        </w:tc>
+        <w:tc>
+          <w:tcPr>
+            <w:tcW w:type="dxa" w:w="4680"/>
+            <w:shd w:val="clear" w:color="auto" w:fill="D9E2F3"/>
+          </w:tcPr>
+          <w:p>
+            <w:pPr>
+              <w:spacing w:after="0"/>
+            </w:pPr>
+            <w:r/>
+            <w:r>
+              <w:rPr>
+                <w:b/>
+                <w:sz w:val="20"/>
+              </w:rPr>
+              <w:t>Now</w:t>
+            </w:r>
+          </w:p>
+        </w:tc>
+      </w:tr>
+      <w:tr>
+        <w:tc>
+          <w:tcPr>
+            <w:tcW w:type="dxa" w:w="4680"/>
+          </w:tcPr>
+          <w:p>
+            <w:pPr>
+              <w:spacing w:after="0"/>
+            </w:pPr>
+            <w:r/>
+            <w:r>
+              <w:rPr>
+                <w:b/>
+                <w:sz w:val="20"/>
+              </w:rPr>
+              <w:t>Credit wallet &amp; billing — switched off behind a flag</w:t>
+            </w:r>
+          </w:p>
+        </w:tc>
+        <w:tc>
+          <w:tcPr>
+            <w:tcW w:type="dxa" w:w="4680"/>
+          </w:tcPr>
+          <w:p>
+            <w:pPr>
+              <w:spacing w:after="0"/>
+            </w:pPr>
+            <w:r/>
+            <w:r>
+              <w:rPr>
+                <w:b/>
+                <w:sz w:val="20"/>
+              </w:rPr>
+              <w:t>Live.</w:t>
+            </w:r>
+            <w:r>
+              <w:rPr>
+                <w:b w:val="0"/>
+                <w:sz w:val="20"/>
+              </w:rPr>
+              <w:t xml:space="preserve"> Billing is now a flat fee per deal, no seats and no subscription, with optional prepaid deals. It appears in Settings → Billing for Admins and owners. Covered in Part 16.</w:t>
+            </w:r>
+          </w:p>
+        </w:tc>
+      </w:tr>
+      <w:tr>
+        <w:tc>
+          <w:tcPr>
+            <w:tcW w:type="dxa" w:w="4680"/>
+          </w:tcPr>
+          <w:p>
+            <w:pPr>
+              <w:spacing w:after="0"/>
+            </w:pPr>
+            <w:r/>
+            <w:r>
+              <w:rPr>
+                <w:b/>
+                <w:sz w:val="20"/>
+              </w:rPr>
+              <w:t>Replies coming back in — unverified</w:t>
+            </w:r>
+          </w:p>
+        </w:tc>
+        <w:tc>
+          <w:tcPr>
+            <w:tcW w:type="dxa" w:w="4680"/>
+          </w:tcPr>
+          <w:p>
+            <w:pPr>
+              <w:spacing w:after="0"/>
+            </w:pPr>
+            <w:r/>
+            <w:r>
+              <w:rPr>
+                <w:b/>
+                <w:sz w:val="20"/>
+              </w:rPr>
+              <w:t>Verified end to end on stage</w:t>
+            </w:r>
+            <w:r>
+              <w:rPr>
+                <w:b w:val="0"/>
+                <w:sz w:val="20"/>
+              </w:rPr>
+              <w:t xml:space="preserve"> on July 28. Covered in Part 9.</w:t>
+            </w:r>
+          </w:p>
+        </w:tc>
+      </w:tr>
+      <w:tr>
+        <w:tc>
+          <w:tcPr>
+            <w:tcW w:type="dxa" w:w="4680"/>
+          </w:tcPr>
+          <w:p>
+            <w:pPr>
+              <w:spacing w:after="0"/>
+            </w:pPr>
+            <w:r/>
+            <w:r>
+              <w:rPr>
+                <w:b/>
+                <w:sz w:val="20"/>
+              </w:rPr>
+              <w:t>Changing your sign-in email address</w:t>
+            </w:r>
+          </w:p>
+        </w:tc>
+        <w:tc>
+          <w:tcPr>
+            <w:tcW w:type="dxa" w:w="4680"/>
+          </w:tcPr>
+          <w:p>
+            <w:pPr>
+              <w:spacing w:after="0"/>
+            </w:pPr>
+            <w:r/>
+            <w:r>
+              <w:rPr>
+                <w:b/>
+                <w:sz w:val="20"/>
+              </w:rPr>
+              <w:t>Done.</w:t>
+            </w:r>
+            <w:r>
+              <w:rPr>
+                <w:b w:val="0"/>
+                <w:sz w:val="20"/>
+              </w:rPr>
+              <w:t xml:space="preserve"> Settings → Profile. Only the password change is still missing (B2).</w:t>
+            </w:r>
+          </w:p>
+        </w:tc>
+      </w:tr>
+      <w:tr>
+        <w:tc>
+          <w:tcPr>
+            <w:tcW w:type="dxa" w:w="4680"/>
+          </w:tcPr>
+          <w:p>
+            <w:pPr>
+              <w:spacing w:after="0"/>
+            </w:pPr>
+            <w:r/>
+            <w:r>
+              <w:rPr>
+                <w:b/>
+                <w:sz w:val="20"/>
+              </w:rPr>
+              <w:t>Belonging to more than one workspace — flag off</w:t>
+            </w:r>
+          </w:p>
+        </w:tc>
+        <w:tc>
+          <w:tcPr>
+            <w:tcW w:type="dxa" w:w="4680"/>
+          </w:tcPr>
+          <w:p>
+            <w:pPr>
+              <w:spacing w:after="0"/>
+            </w:pPr>
+            <w:r/>
+            <w:r>
+              <w:rPr>
+                <w:b w:val="0"/>
+                <w:sz w:val="20"/>
+              </w:rPr>
+              <w:t xml:space="preserve">The feature is </w:t>
+            </w:r>
+            <w:r>
+              <w:rPr>
+                <w:b/>
+                <w:sz w:val="20"/>
+              </w:rPr>
+              <w:t>on</w:t>
+            </w:r>
+            <w:r>
+              <w:rPr>
+                <w:b w:val="0"/>
+                <w:sz w:val="20"/>
+              </w:rPr>
+              <w:t>; only the guest-billing rule is outstanding (B6).</w:t>
+            </w:r>
+          </w:p>
+        </w:tc>
+      </w:tr>
+    </w:tbl>
+    <w:p/>
+    <w:p>
+      <w:pPr>
+        <w:spacing w:after="120"/>
+      </w:pPr>
+    </w:p>
+    <w:p>
+      <w:pPr>
         <w:pStyle w:val="Heading1"/>
         <w:spacing w:after="120" w:before="360"/>
       </w:pPr>
@@ -1819,21 +2029,7 @@
           <w:b w:val="0"/>
           <w:sz w:val="20"/>
         </w:rPr>
-        <w:t xml:space="preserve">Section A was checked against the live source code on July 28, 2026, after the task-and-email fixes landed. Section B was first written on June 30, 2026 and re-checked on July 28. As each item is finished, it will move out of this list and into the main </w:t>
-      </w:r>
-      <w:r>
-        <w:rPr>
-          <w:b/>
-          <w:sz w:val="20"/>
-        </w:rPr>
-        <w:t>FRONTEND_CLIENT_TESTING_REVIEW</w:t>
-      </w:r>
-      <w:r>
-        <w:rPr>
-          <w:b w:val="0"/>
-          <w:sz w:val="20"/>
-        </w:rPr>
-        <w:t xml:space="preserve"> with full step-by-step testing instructions.</w:t>
+        <w:t>Every item was checked against the live source code on July 31, 2026 — not against an earlier plan document. Where a plan and the code disagreed, the code won and this list follows the code. As each item is finished it moves out of this list and into a testing guide with step-by-step instructions.</w:t>
       </w:r>
     </w:p>
     <w:sectPr>

</xml_diff>

<commit_message>
docs(email): describe Gmail and Outlook only, and how automation actually runs
- Strip Apple Mail from plans, testing guides, and the feature list
- Add how the live automation system operates, and how welcome letters send by posture
- Wire those files through generate_docs.py so the Word export uses the house fonts
</commit_message>
<xml_diff>
--- a/TODO_LIST.docx
+++ b/TODO_LIST.docx
@@ -805,100 +805,6 @@
     </w:p>
     <w:p>
       <w:pPr>
-        <w:pStyle w:val="Heading2"/>
-        <w:spacing w:after="80" w:before="240"/>
-      </w:pPr>
-      <w:r>
-        <w:t>A6. iCloud mailboxes</w:t>
-      </w:r>
-    </w:p>
-    <w:p>
-      <w:pPr>
-        <w:spacing w:after="80"/>
-      </w:pPr>
-      <w:r>
-        <w:rPr>
-          <w:b/>
-          <w:sz w:val="20"/>
-        </w:rPr>
-        <w:t>Where:</w:t>
-      </w:r>
-      <w:r>
-        <w:rPr>
-          <w:b w:val="0"/>
-          <w:sz w:val="20"/>
-        </w:rPr>
-        <w:t xml:space="preserve"> Settings → Email &amp; E-signature.</w:t>
-      </w:r>
-    </w:p>
-    <w:p>
-      <w:pPr>
-        <w:spacing w:after="80"/>
-      </w:pPr>
-      <w:r>
-        <w:rPr>
-          <w:b/>
-          <w:sz w:val="20"/>
-        </w:rPr>
-        <w:t>Current state:</w:t>
-      </w:r>
-      <w:r>
-        <w:rPr>
-          <w:b w:val="0"/>
-          <w:sz w:val="20"/>
-        </w:rPr>
-        <w:t xml:space="preserve"> only </w:t>
-      </w:r>
-      <w:r>
-        <w:rPr>
-          <w:b/>
-          <w:sz w:val="20"/>
-        </w:rPr>
-        <w:t>Gmail</w:t>
-      </w:r>
-      <w:r>
-        <w:rPr>
-          <w:b w:val="0"/>
-          <w:sz w:val="20"/>
-        </w:rPr>
-        <w:t xml:space="preserve"> and </w:t>
-      </w:r>
-      <w:r>
-        <w:rPr>
-          <w:b/>
-          <w:sz w:val="20"/>
-        </w:rPr>
-        <w:t>Outlook</w:t>
-      </w:r>
-      <w:r>
-        <w:rPr>
-          <w:b w:val="0"/>
-          <w:sz w:val="20"/>
-        </w:rPr>
-        <w:t xml:space="preserve"> are offered. iCloud is intentionally hidden because Apple does not offer a standard one-click sign-in and needs an "app-specific password" flow we still want to review. It also has no equivalent of the </w:t>
-      </w:r>
-      <w:r>
-        <w:rPr>
-          <w:b/>
-          <w:sz w:val="20"/>
-        </w:rPr>
-        <w:t>Test connection</w:t>
-      </w:r>
-      <w:r>
-        <w:rPr>
-          <w:b w:val="0"/>
-          <w:sz w:val="20"/>
-        </w:rPr>
-        <w:t xml:space="preserve"> check the other two have.</w:t>
-      </w:r>
-    </w:p>
-    <w:p>
-      <w:pPr>
-        <w:spacing w:after="120"/>
-      </w:pPr>
-    </w:p>
-    <w:p>
-      <w:pPr>
         <w:pStyle w:val="Heading1"/>
         <w:spacing w:after="120" w:before="360"/>
       </w:pPr>
@@ -1271,7 +1177,7 @@
           <w:b w:val="0"/>
           <w:sz w:val="20"/>
         </w:rPr>
-        <w:t xml:space="preserve"> — the AI assistant, its proposals and approvals, the safe date moves, document analysis on upload, and all seven tabs (Timeline, Compliance, Documents, Tasks, People, Activity, Email). A few extras around it are still being built:</w:t>
+        <w:t xml:space="preserve"> — the AI assistant, its proposals and approvals, the safe date moves, document analysis on upload, and all seven tabs (Timeline, Compliance, Documents, Tasks, Contacts, Activity, Email). A few extras around it are still being built:</w:t>
       </w:r>
     </w:p>
     <w:p>

</xml_diff>